<commit_message>
Update Government Savings Automation Assessment documentation and add new files
- Revised the README.md to reflect the latest assessment date and status, including new metrics and findings.
- Introduced the Contradiction Resolution Ledger and Current Claim Register to track discrepancies and claims.
- Added Render and Visual QA documentation to validate document exports.
- Updated the Coverage Calculation Notes and added new files for Source-Code Coverage Assessment and Verified Metrics Register.
- Enhanced the CI Gate Assessment and Government Savings Coverage Matrix with updated metrics and findings.
- Proposed action items for leadership to improve automation coverage and reporting processes.

These changes aim to provide a clearer overview of the assessment status and facilitate better decision-making for future automation efforts.
</commit_message>
<xml_diff>
--- a/government-savings-automation-assessment/04-leadership/Government-Savings-Automation-Coverage-Assessment.docx
+++ b/government-savings-automation-assessment/04-leadership/Government-Savings-Automation-Coverage-Assessment.docx
@@ -18,7 +18,6 @@
       <w:r>
         <w:rPr>
           <w:b/>
-          <w:sz w:val="28"/>
         </w:rPr>
         <w:t>Automation Coverage &amp; CI Integration Assessment</w:t>
       </w:r>
@@ -30,7 +29,7 @@
       <w:r>
         <w:t>Assessment Date: July 20, 2026</w:t>
         <w:br/>
-        <w:t>Prepared for: Ascensus Leadership</w:t>
+        <w:t>Rebuild validated: July 21, 2026</w:t>
       </w:r>
     </w:p>
     <w:p>
@@ -43,7 +42,7 @@
     </w:p>
     <w:p>
       <w:r>
-        <w:t>Government Savings has meaningful automated coverage across Universal Platform V3 UI (GitLab nightly), legacy V2 UI (large Jenkins/Ant corpus), MSC Mobile APIs (100% in-scope endpoint automation in code), metadataweb API (GitLab nightly), and performance assets. A single GS-wide coverage percentage is not defensible without a unified business denominator. Verified metrics: V3 UI 86.9% inventory share; V2 UP-scoped 36.0%; Mobile 2 API 100% (24/24 endpoints); Mobile 1 API 22.2% (6/27 endpoints).</w:t>
+        <w:t>Government Savings has meaningful automation across V3 UI (GitLab scheduled regression), legacy V2 (large Jenkins/Ant corpus), MSC Mobile APIs, metadataweb API nightly, and performance assets. A single GS-wide coverage percentage is not defensible without governed denominators. Verified platform metrics are reported separately from pending sign-off metrics.</w:t>
       </w:r>
     </w:p>
     <w:p>
@@ -51,7 +50,7 @@
         <w:pStyle w:val="Heading1"/>
       </w:pPr>
       <w:r>
-        <w:t>Verified Coverage Snapshot</w:t>
+        <w:t>Verified Metrics (leadership-safe)</w:t>
       </w:r>
     </w:p>
     <w:tbl>
@@ -61,15 +60,16 @@
         <w:tblLook w:firstColumn="1" w:firstRow="1" w:lastColumn="0" w:lastRow="0" w:noHBand="0" w:noVBand="1" w:val="04A0"/>
       </w:tblPr>
       <w:tblGrid>
-        <w:gridCol w:w="2160"/>
-        <w:gridCol w:w="2160"/>
-        <w:gridCol w:w="2160"/>
-        <w:gridCol w:w="2160"/>
+        <w:gridCol w:w="1728"/>
+        <w:gridCol w:w="1728"/>
+        <w:gridCol w:w="1728"/>
+        <w:gridCol w:w="1728"/>
+        <w:gridCol w:w="1728"/>
       </w:tblGrid>
       <w:tr>
         <w:tc>
           <w:tcPr>
-            <w:tcW w:type="dxa" w:w="2160"/>
+            <w:tcW w:type="dxa" w:w="1728"/>
           </w:tcPr>
           <w:p>
             <w:r>
@@ -82,7 +82,7 @@
         </w:tc>
         <w:tc>
           <w:tcPr>
-            <w:tcW w:type="dxa" w:w="2160"/>
+            <w:tcW w:type="dxa" w:w="1728"/>
           </w:tcPr>
           <w:p>
             <w:r>
@@ -95,7 +95,7 @@
         </w:tc>
         <w:tc>
           <w:tcPr>
-            <w:tcW w:type="dxa" w:w="2160"/>
+            <w:tcW w:type="dxa" w:w="1728"/>
           </w:tcPr>
           <w:p>
             <w:r>
@@ -108,14 +108,27 @@
         </w:tc>
         <w:tc>
           <w:tcPr>
-            <w:tcW w:type="dxa" w:w="2160"/>
+            <w:tcW w:type="dxa" w:w="1728"/>
           </w:tcPr>
           <w:p>
             <w:r>
               <w:rPr>
                 <w:b/>
               </w:rPr>
-              <w:t>CI Scheduled</w:t>
+              <w:t>As of</w:t>
+            </w:r>
+          </w:p>
+        </w:tc>
+        <w:tc>
+          <w:tcPr>
+            <w:tcW w:type="dxa" w:w="1728"/>
+          </w:tcPr>
+          <w:p>
+            <w:r>
+              <w:rPr>
+                <w:b/>
+              </w:rPr>
+              <w:t>Evidence</w:t>
             </w:r>
           </w:p>
         </w:tc>
@@ -123,41 +136,51 @@
       <w:tr>
         <w:tc>
           <w:tcPr>
-            <w:tcW w:type="dxa" w:w="2160"/>
+            <w:tcW w:type="dxa" w:w="1728"/>
           </w:tcPr>
           <w:p>
             <w:r>
-              <w:t>V3 / UE UI</w:t>
+              <w:t>Business automation</w:t>
             </w:r>
           </w:p>
         </w:tc>
         <w:tc>
           <w:tcPr>
-            <w:tcW w:type="dxa" w:w="2160"/>
+            <w:tcW w:type="dxa" w:w="1728"/>
           </w:tcPr>
           <w:p>
             <w:r>
-              <w:t>TestNG inventory share</w:t>
+              <w:t>V3 scoped TestNG nightly share</w:t>
             </w:r>
           </w:p>
         </w:tc>
         <w:tc>
           <w:tcPr>
-            <w:tcW w:type="dxa" w:w="2160"/>
+            <w:tcW w:type="dxa" w:w="1728"/>
           </w:tcPr>
           <w:p>
             <w:r>
-              <w:t>86.9% (379/436)</w:t>
+              <w:t>379/436</w:t>
             </w:r>
           </w:p>
         </w:tc>
         <w:tc>
           <w:tcPr>
-            <w:tcW w:type="dxa" w:w="2160"/>
+            <w:tcW w:type="dxa" w:w="1728"/>
           </w:tcPr>
           <w:p>
             <w:r>
-              <w:t>Yes — GitLab</w:t>
+              <w:t>2026-07-01</w:t>
+            </w:r>
+          </w:p>
+        </w:tc>
+        <w:tc>
+          <w:tcPr>
+            <w:tcW w:type="dxa" w:w="1728"/>
+          </w:tcPr>
+          <w:p>
+            <w:r>
+              <w:t>universal-platform-coverage/01-analysis/10-reconciliation-le</w:t>
             </w:r>
           </w:p>
         </w:tc>
@@ -165,41 +188,51 @@
       <w:tr>
         <w:tc>
           <w:tcPr>
-            <w:tcW w:type="dxa" w:w="2160"/>
+            <w:tcW w:type="dxa" w:w="1728"/>
           </w:tcPr>
           <w:p>
             <w:r>
-              <w:t>V2 UI (UP)</w:t>
+              <w:t>Business automation</w:t>
             </w:r>
           </w:p>
         </w:tc>
         <w:tc>
           <w:tcPr>
-            <w:tcW w:type="dxa" w:w="2160"/>
+            <w:tcW w:type="dxa" w:w="1728"/>
           </w:tcPr>
           <w:p>
             <w:r>
-              <w:t>qTest inventory share</w:t>
+              <w:t>V2 UP-scoped qTest share</w:t>
             </w:r>
           </w:p>
         </w:tc>
         <w:tc>
           <w:tcPr>
-            <w:tcW w:type="dxa" w:w="2160"/>
+            <w:tcW w:type="dxa" w:w="1728"/>
           </w:tcPr>
           <w:p>
             <w:r>
-              <w:t>36.0% (268/744)</w:t>
+              <w:t>268/744</w:t>
             </w:r>
           </w:p>
         </w:tc>
         <w:tc>
           <w:tcPr>
-            <w:tcW w:type="dxa" w:w="2160"/>
+            <w:tcW w:type="dxa" w:w="1728"/>
           </w:tcPr>
           <w:p>
             <w:r>
-              <w:t>Jenkins — TBD</w:t>
+              <w:t>2026-06-29</w:t>
+            </w:r>
+          </w:p>
+        </w:tc>
+        <w:tc>
+          <w:tcPr>
+            <w:tcW w:type="dxa" w:w="1728"/>
+          </w:tcPr>
+          <w:p>
+            <w:r>
+              <w:t>universal-platform-coverage/01-analysis/10-reconciliation-le</w:t>
             </w:r>
           </w:p>
         </w:tc>
@@ -207,41 +240,51 @@
       <w:tr>
         <w:tc>
           <w:tcPr>
-            <w:tcW w:type="dxa" w:w="2160"/>
+            <w:tcW w:type="dxa" w:w="1728"/>
           </w:tcPr>
           <w:p>
             <w:r>
-              <w:t>Mobile 2 API</w:t>
+              <w:t>Business automation</w:t>
             </w:r>
           </w:p>
         </w:tc>
         <w:tc>
           <w:tcPr>
-            <w:tcW w:type="dxa" w:w="2160"/>
+            <w:tcW w:type="dxa" w:w="1728"/>
           </w:tcPr>
           <w:p>
             <w:r>
-              <w:t>Endpoint automation</w:t>
+              <w:t>Mobile 2 verified endpoint automation</w:t>
             </w:r>
           </w:p>
         </w:tc>
         <w:tc>
           <w:tcPr>
-            <w:tcW w:type="dxa" w:w="2160"/>
+            <w:tcW w:type="dxa" w:w="1728"/>
           </w:tcPr>
           <w:p>
             <w:r>
-              <w:t>100% (24/24)</w:t>
+              <w:t>22/25</w:t>
             </w:r>
           </w:p>
         </w:tc>
         <w:tc>
           <w:tcPr>
-            <w:tcW w:type="dxa" w:w="2160"/>
+            <w:tcW w:type="dxa" w:w="1728"/>
           </w:tcPr>
           <w:p>
             <w:r>
-              <w:t>No — QA-1405</w:t>
+              <w:t>2026-07-14</w:t>
+            </w:r>
+          </w:p>
+        </w:tc>
+        <w:tc>
+          <w:tcPr>
+            <w:tcW w:type="dxa" w:w="1728"/>
+          </w:tcPr>
+          <w:p>
+            <w:r>
+              <w:t>api-test-automation/mobile/project-documents/local-mobile-ap</w:t>
             </w:r>
           </w:p>
         </w:tc>
@@ -249,41 +292,51 @@
       <w:tr>
         <w:tc>
           <w:tcPr>
-            <w:tcW w:type="dxa" w:w="2160"/>
+            <w:tcW w:type="dxa" w:w="1728"/>
           </w:tcPr>
           <w:p>
             <w:r>
-              <w:t>Mobile 1 API</w:t>
+              <w:t>Business automation</w:t>
             </w:r>
           </w:p>
         </w:tc>
         <w:tc>
           <w:tcPr>
-            <w:tcW w:type="dxa" w:w="2160"/>
+            <w:tcW w:type="dxa" w:w="1728"/>
           </w:tcPr>
           <w:p>
             <w:r>
-              <w:t>Endpoint automation</w:t>
+              <w:t>Mobile 1 verified endpoint automation</w:t>
             </w:r>
           </w:p>
         </w:tc>
         <w:tc>
           <w:tcPr>
-            <w:tcW w:type="dxa" w:w="2160"/>
+            <w:tcW w:type="dxa" w:w="1728"/>
           </w:tcPr>
           <w:p>
             <w:r>
-              <w:t>22.2% (6/27)</w:t>
+              <w:t>1/27</w:t>
             </w:r>
           </w:p>
         </w:tc>
         <w:tc>
           <w:tcPr>
-            <w:tcW w:type="dxa" w:w="2160"/>
+            <w:tcW w:type="dxa" w:w="1728"/>
           </w:tcPr>
           <w:p>
             <w:r>
-              <w:t>No</w:t>
+              <w:t>2026-07-09</w:t>
+            </w:r>
+          </w:p>
+        </w:tc>
+        <w:tc>
+          <w:tcPr>
+            <w:tcW w:type="dxa" w:w="1728"/>
+          </w:tcPr>
+          <w:p>
+            <w:r>
+              <w:t>api-test-automation/.../03-document-postman-coverage-matrix.</w:t>
             </w:r>
           </w:p>
         </w:tc>
@@ -291,41 +344,141 @@
       <w:tr>
         <w:tc>
           <w:tcPr>
-            <w:tcW w:type="dxa" w:w="2160"/>
+            <w:tcW w:type="dxa" w:w="1728"/>
           </w:tcPr>
           <w:p>
             <w:r>
-              <w:t>UP API</w:t>
+              <w:t>Gate coverage</w:t>
             </w:r>
           </w:p>
         </w:tc>
         <w:tc>
           <w:tcPr>
-            <w:tcW w:type="dxa" w:w="2160"/>
+            <w:tcW w:type="dxa" w:w="1728"/>
           </w:tcPr>
           <w:p>
             <w:r>
-              <w:t>Operations</w:t>
+              <w:t>V3 UI scheduled job hard-fail</w:t>
             </w:r>
           </w:p>
         </w:tc>
         <w:tc>
           <w:tcPr>
-            <w:tcW w:type="dxa" w:w="2160"/>
+            <w:tcW w:type="dxa" w:w="1728"/>
           </w:tcPr>
           <w:p>
             <w:r>
-              <w:t>11 automated</w:t>
+              <w:t>1/1</w:t>
             </w:r>
           </w:p>
         </w:tc>
         <w:tc>
           <w:tcPr>
-            <w:tcW w:type="dxa" w:w="2160"/>
+            <w:tcW w:type="dxa" w:w="1728"/>
           </w:tcPr>
           <w:p>
             <w:r>
-              <w:t>Partial</w:t>
+              <w:t>2026-07-20</w:t>
+            </w:r>
+          </w:p>
+        </w:tc>
+        <w:tc>
+          <w:tcPr>
+            <w:tcW w:type="dxa" w:w="1728"/>
+          </w:tcPr>
+          <w:p>
+            <w:r>
+              <w:t>prime-test-automation/.gitlab-ci.yml</w:t>
+            </w:r>
+          </w:p>
+        </w:tc>
+      </w:tr>
+    </w:tbl>
+    <w:p/>
+    <w:p>
+      <w:pPr>
+        <w:pStyle w:val="Heading1"/>
+      </w:pPr>
+      <w:r>
+        <w:t>Pending Verification (do not quote as final)</w:t>
+      </w:r>
+    </w:p>
+    <w:tbl>
+      <w:tblPr>
+        <w:tblStyle w:val="TableGrid"/>
+        <w:tblW w:type="auto" w:w="0"/>
+        <w:tblLook w:firstColumn="1" w:firstRow="1" w:lastColumn="0" w:lastRow="0" w:noHBand="0" w:noVBand="1" w:val="04A0"/>
+      </w:tblPr>
+      <w:tblGrid>
+        <w:gridCol w:w="1728"/>
+        <w:gridCol w:w="1728"/>
+        <w:gridCol w:w="1728"/>
+        <w:gridCol w:w="1728"/>
+        <w:gridCol w:w="1728"/>
+      </w:tblGrid>
+      <w:tr>
+        <w:tc>
+          <w:tcPr>
+            <w:tcW w:type="dxa" w:w="1728"/>
+          </w:tcPr>
+          <w:p>
+            <w:r>
+              <w:rPr>
+                <w:b/>
+              </w:rPr>
+              <w:t>Area</w:t>
+            </w:r>
+          </w:p>
+        </w:tc>
+        <w:tc>
+          <w:tcPr>
+            <w:tcW w:type="dxa" w:w="1728"/>
+          </w:tcPr>
+          <w:p>
+            <w:r>
+              <w:rPr>
+                <w:b/>
+              </w:rPr>
+              <w:t>Metric</w:t>
+            </w:r>
+          </w:p>
+        </w:tc>
+        <w:tc>
+          <w:tcPr>
+            <w:tcW w:type="dxa" w:w="1728"/>
+          </w:tcPr>
+          <w:p>
+            <w:r>
+              <w:rPr>
+                <w:b/>
+              </w:rPr>
+              <w:t>Projected</w:t>
+            </w:r>
+          </w:p>
+        </w:tc>
+        <w:tc>
+          <w:tcPr>
+            <w:tcW w:type="dxa" w:w="1728"/>
+          </w:tcPr>
+          <w:p>
+            <w:r>
+              <w:rPr>
+                <w:b/>
+              </w:rPr>
+              <w:t>As of</w:t>
+            </w:r>
+          </w:p>
+        </w:tc>
+        <w:tc>
+          <w:tcPr>
+            <w:tcW w:type="dxa" w:w="1728"/>
+          </w:tcPr>
+          <w:p>
+            <w:r>
+              <w:rPr>
+                <w:b/>
+              </w:rPr>
+              <w:t>Dependency</w:t>
             </w:r>
           </w:p>
         </w:tc>
@@ -333,41 +486,103 @@
       <w:tr>
         <w:tc>
           <w:tcPr>
-            <w:tcW w:type="dxa" w:w="2160"/>
+            <w:tcW w:type="dxa" w:w="1728"/>
           </w:tcPr>
           <w:p>
             <w:r>
-              <w:t>Performance</w:t>
+              <w:t>Business automation</w:t>
             </w:r>
           </w:p>
         </w:tc>
         <w:tc>
           <w:tcPr>
-            <w:tcW w:type="dxa" w:w="2160"/>
+            <w:tcW w:type="dxa" w:w="1728"/>
           </w:tcPr>
           <w:p>
             <w:r>
-              <w:t>Journeys</w:t>
+              <w:t>Mobile 2 code-implemented (pending sign-off)</w:t>
             </w:r>
           </w:p>
         </w:tc>
         <w:tc>
           <w:tcPr>
-            <w:tcW w:type="dxa" w:w="2160"/>
+            <w:tcW w:type="dxa" w:w="1728"/>
           </w:tcPr>
           <w:p>
             <w:r>
-              <w:t>15 in-scope</w:t>
+              <w:t>24/25</w:t>
             </w:r>
           </w:p>
         </w:tc>
         <w:tc>
           <w:tcPr>
-            <w:tcW w:type="dxa" w:w="2160"/>
+            <w:tcW w:type="dxa" w:w="1728"/>
           </w:tcPr>
           <w:p>
             <w:r>
-              <w:t>IDP scheduled</w:t>
+              <w:t>2026-07-20</w:t>
+            </w:r>
+          </w:p>
+        </w:tc>
+        <w:tc>
+          <w:tcPr>
+            <w:tcW w:type="dxa" w:w="1728"/>
+          </w:tcPr>
+          <w:p>
+            <w:r>
+              <w:t>YTD + GET mobilebanks/{id} in code; QC4/Stage1 rerun + matrix refresh required</w:t>
+            </w:r>
+          </w:p>
+        </w:tc>
+      </w:tr>
+      <w:tr>
+        <w:tc>
+          <w:tcPr>
+            <w:tcW w:type="dxa" w:w="1728"/>
+          </w:tcPr>
+          <w:p>
+            <w:r>
+              <w:t>Business automation</w:t>
+            </w:r>
+          </w:p>
+        </w:tc>
+        <w:tc>
+          <w:tcPr>
+            <w:tcW w:type="dxa" w:w="1728"/>
+          </w:tcPr>
+          <w:p>
+            <w:r>
+              <w:t>Mobile 1 implemented pending evidence</w:t>
+            </w:r>
+          </w:p>
+        </w:tc>
+        <w:tc>
+          <w:tcPr>
+            <w:tcW w:type="dxa" w:w="1728"/>
+          </w:tcPr>
+          <w:p>
+            <w:r>
+              <w:t>6/27</w:t>
+            </w:r>
+          </w:p>
+        </w:tc>
+        <w:tc>
+          <w:tcPr>
+            <w:tcW w:type="dxa" w:w="1728"/>
+          </w:tcPr>
+          <w:p>
+            <w:r>
+              <w:t>2026-07-20</w:t>
+            </w:r>
+          </w:p>
+        </w:tc>
+        <w:tc>
+          <w:tcPr>
+            <w:tcW w:type="dxa" w:w="1728"/>
+          </w:tcPr>
+          <w:p>
+            <w:r>
+              <w:t>Five endpoints implemented; not sign-off ready</w:t>
             </w:r>
           </w:p>
         </w:tc>
@@ -384,7 +599,7 @@
     </w:p>
     <w:p>
       <w:r>
-        <w:t>GitLab: V3 scheduled_regression_job (hard gate) and api-test-automation metadataweb Stage1 nightly. GitHub Actions: Mobile 2 workflow documented but not in repository. Jenkins: IDP performance scheduled weekdays; MSC endurance manual; V2/Ant targets exist.</w:t>
+        <w:t>GitLab: V3 scheduled_regression_job and metadataweb Stage1 — scheduled jobs exit non-zero on failure (not verified as MR merge gates). GitHub Actions: Mobile 2 Dashboard vertical slice externally validated; workflow repository not in audit clone. Jenkins: IDP performance scheduled; V2 UI recurring job not verified. Mobile 2 GitLab nightly not created (QA-1405).</w:t>
       </w:r>
     </w:p>
     <w:p>
@@ -392,218 +607,12 @@
         <w:pStyle w:val="Heading1"/>
       </w:pPr>
       <w:r>
-        <w:t>Key Gaps</w:t>
+        <w:t>Leadership Narrative</w:t>
       </w:r>
     </w:p>
     <w:p>
-      <w:pPr>
-        <w:pStyle w:val="ListBullet"/>
-      </w:pPr>
       <w:r>
-        <w:t>Mobile 2 GitLab nightly not implemented (QA-1405)</w:t>
-      </w:r>
-    </w:p>
-    <w:p>
-      <w:pPr>
-        <w:pStyle w:val="ListBullet"/>
-      </w:pPr>
-      <w:r>
-        <w:t>Mobile 1 — 21 of 27 endpoints not automated</w:t>
-      </w:r>
-    </w:p>
-    <w:p>
-      <w:pPr>
-        <w:pStyle w:val="ListBullet"/>
-      </w:pPr>
-      <w:r>
-        <w:t>ASTRO and full V2 backoffice not on V3 GitLab schedule</w:t>
-      </w:r>
-    </w:p>
-    <w:p>
-      <w:pPr>
-        <w:pStyle w:val="ListBullet"/>
-      </w:pPr>
-      <w:r>
-        <w:t>COPACS — no automation identified</w:t>
-      </w:r>
-    </w:p>
-    <w:p>
-      <w:pPr>
-        <w:pStyle w:val="ListBullet"/>
-      </w:pPr>
-      <w:r>
-        <w:t>No unified GS denominator for one headline %</w:t>
-      </w:r>
-    </w:p>
-    <w:p>
-      <w:pPr>
-        <w:pStyle w:val="Heading1"/>
-      </w:pPr>
-      <w:r>
-        <w:t>Leadership Decisions Required</w:t>
-      </w:r>
-    </w:p>
-    <w:p>
-      <w:pPr>
-        <w:pStyle w:val="ListNumber"/>
-      </w:pPr>
-      <w:r>
-        <w:t>Prioritize Mobile 2 GitLab nightly as MSC API gate</w:t>
-      </w:r>
-    </w:p>
-    <w:p>
-      <w:pPr>
-        <w:pStyle w:val="ListNumber"/>
-      </w:pPr>
-      <w:r>
-        <w:t>Confirm Mobile 1 sprint scope and target endpoints</w:t>
-      </w:r>
-    </w:p>
-    <w:p>
-      <w:pPr>
-        <w:pStyle w:val="ListNumber"/>
-      </w:pPr>
-      <w:r>
-        <w:t>Clarify code coverage vs test automation coverage terminology</w:t>
-      </w:r>
-    </w:p>
-    <w:p>
-      <w:pPr>
-        <w:pStyle w:val="ListNumber"/>
-      </w:pPr>
-      <w:r>
-        <w:t>V2/Jenkins vs V3/GitLab consolidation strategy</w:t>
-      </w:r>
-    </w:p>
-    <w:p>
-      <w:pPr>
-        <w:pStyle w:val="ListNumber"/>
-      </w:pPr>
-      <w:r>
-        <w:t>COPACS and ASTRO scope ownership</w:t>
-      </w:r>
-    </w:p>
-    <w:p>
-      <w:pPr>
-        <w:pStyle w:val="Heading1"/>
-      </w:pPr>
-      <w:r>
-        <w:t>Roadmap Horizons</w:t>
-      </w:r>
-    </w:p>
-    <w:tbl>
-      <w:tblPr>
-        <w:tblStyle w:val="TableGrid"/>
-        <w:tblW w:type="auto" w:w="0"/>
-        <w:tblLook w:firstColumn="1" w:firstRow="1" w:lastColumn="0" w:lastRow="0" w:noHBand="0" w:noVBand="1" w:val="04A0"/>
-      </w:tblPr>
-      <w:tblGrid>
-        <w:gridCol w:w="4320"/>
-        <w:gridCol w:w="4320"/>
-      </w:tblGrid>
-      <w:tr>
-        <w:tc>
-          <w:tcPr>
-            <w:tcW w:type="dxa" w:w="4320"/>
-          </w:tcPr>
-          <w:p>
-            <w:r>
-              <w:rPr>
-                <w:b/>
-              </w:rPr>
-              <w:t>Horizon</w:t>
-            </w:r>
-          </w:p>
-        </w:tc>
-        <w:tc>
-          <w:tcPr>
-            <w:tcW w:type="dxa" w:w="4320"/>
-          </w:tcPr>
-          <w:p>
-            <w:r>
-              <w:rPr>
-                <w:b/>
-              </w:rPr>
-              <w:t>Focus</w:t>
-            </w:r>
-          </w:p>
-        </w:tc>
-      </w:tr>
-      <w:tr>
-        <w:tc>
-          <w:tcPr>
-            <w:tcW w:type="dxa" w:w="4320"/>
-          </w:tcPr>
-          <w:p>
-            <w:r>
-              <w:t>0–30 days</w:t>
-            </w:r>
-          </w:p>
-        </w:tc>
-        <w:tc>
-          <w:tcPr>
-            <w:tcW w:type="dxa" w:w="4320"/>
-          </w:tcPr>
-          <w:p>
-            <w:r>
-              <w:t>M2 CI nightly, evidence refresh, M1 sprint, CI inventory</w:t>
-            </w:r>
-          </w:p>
-        </w:tc>
-      </w:tr>
-      <w:tr>
-        <w:tc>
-          <w:tcPr>
-            <w:tcW w:type="dxa" w:w="4320"/>
-          </w:tcPr>
-          <w:p>
-            <w:r>
-              <w:t>30–90 days</w:t>
-            </w:r>
-          </w:p>
-        </w:tc>
-        <w:tc>
-          <w:tcPr>
-            <w:tcW w:type="dxa" w:w="4320"/>
-          </w:tcPr>
-          <w:p>
-            <w:r>
-              <w:t>M1 IDP, perf schedule, ASTRO/COPACS scope, qTest mapping</w:t>
-            </w:r>
-          </w:p>
-        </w:tc>
-      </w:tr>
-      <w:tr>
-        <w:tc>
-          <w:tcPr>
-            <w:tcW w:type="dxa" w:w="4320"/>
-          </w:tcPr>
-          <w:p>
-            <w:r>
-              <w:t>90+ days</w:t>
-            </w:r>
-          </w:p>
-        </w:tc>
-        <w:tc>
-          <w:tcPr>
-            <w:tcW w:type="dxa" w:w="4320"/>
-          </w:tcPr>
-          <w:p>
-            <w:r>
-              <w:t>Enrollment API, microservice gates, quarterly GS roadmap</w:t>
-            </w:r>
-          </w:p>
-        </w:tc>
-      </w:tr>
-    </w:tbl>
-    <w:p/>
-    <w:p/>
-    <w:p>
-      <w:r>
-        <w:rPr>
-          <w:i/>
-        </w:rPr>
-        <w:t>Full detail: qa-automation-kb/government-savings-automation-assessment/ including Excel matrix and CSV inventories.</w:t>
+        <w:t>The team has meaningful automation across Government Savings. The current limitation is not the ability to build automation; it is establishing a consistent, traceable coverage model across Jira, qTest, repositories, and CI execution.</w:t>
       </w:r>
     </w:p>
     <w:sectPr>
@@ -627,10 +636,9 @@
     </w:pPr>
     <w:r>
       <w:rPr>
-        <w:color w:val="616161"/>
         <w:sz w:val="18"/>
       </w:rPr>
-      <w:t xml:space="preserve">Confidential — Internal Use  |  July 20, 2026  |  Page </w:t>
+      <w:t xml:space="preserve">Confidential — Internal Use  |  July 21, 2026  |  Page </w:t>
     </w:r>
     <w:fldSimple w:instr="PAGE"/>
   </w:p>
@@ -642,7 +650,6 @@
   <w:p>
     <w:pPr>
       <w:pStyle w:val="Header"/>
-      <w:jc w:val="left"/>
     </w:pPr>
     <w:r>
       <w:rPr>

</xml_diff>

<commit_message>
Update Government Savings Automation Assessment with new metrics and documentation
- Revised the Executive Summary to include updated metrics and findings from the latest assessment.
- Added new CSV files for live validation registers, pipeline live validation, and endpoint current states for Mobile 1 and Mobile 2 APIs.
- Enhanced the technical assessment documentation to reflect the current state of automation coverage and CI integration.
- Updated the Government Savings Coverage Matrix and verified metrics register with the latest data.
- Improved the Render and Visual QA documentation to ensure accurate reporting of document exports.

These changes aim to provide a comprehensive overview of the automation coverage status and facilitate informed decision-making for future improvements.
</commit_message>
<xml_diff>
--- a/government-savings-automation-assessment/04-leadership/Government-Savings-Automation-Coverage-Assessment.docx
+++ b/government-savings-automation-assessment/04-leadership/Government-Savings-Automation-Coverage-Assessment.docx
@@ -140,7 +140,163 @@
           </w:tcPr>
           <w:p>
             <w:r>
-              <w:t>Business automation</w:t>
+              <w:t>Unite MSC</w:t>
+            </w:r>
+          </w:p>
+        </w:tc>
+        <w:tc>
+          <w:tcPr>
+            <w:tcW w:type="dxa" w:w="1728"/>
+          </w:tcPr>
+          <w:p>
+            <w:r>
+              <w:t>Mobile 2 business endpoint automation (code)</w:t>
+            </w:r>
+          </w:p>
+        </w:tc>
+        <w:tc>
+          <w:tcPr>
+            <w:tcW w:type="dxa" w:w="1728"/>
+          </w:tcPr>
+          <w:p>
+            <w:r>
+              <w:t>96.0%</w:t>
+            </w:r>
+          </w:p>
+        </w:tc>
+        <w:tc>
+          <w:tcPr>
+            <w:tcW w:type="dxa" w:w="1728"/>
+          </w:tcPr>
+          <w:p>
+            <w:r>
+              <w:t>2026-07-20T18:15:00-04:00</w:t>
+            </w:r>
+          </w:p>
+        </w:tc>
+        <w:tc>
+          <w:tcPr>
+            <w:tcW w:type="dxa" w:w="1728"/>
+          </w:tcPr>
+          <w:p>
+            <w:r>
+              <w:t>C:\Workspace\GitLab\api-test-automation/mobile/mobile2</w:t>
+            </w:r>
+          </w:p>
+        </w:tc>
+      </w:tr>
+      <w:tr>
+        <w:tc>
+          <w:tcPr>
+            <w:tcW w:type="dxa" w:w="1728"/>
+          </w:tcPr>
+          <w:p>
+            <w:r>
+              <w:t>Unite MSC</w:t>
+            </w:r>
+          </w:p>
+        </w:tc>
+        <w:tc>
+          <w:tcPr>
+            <w:tcW w:type="dxa" w:w="1728"/>
+          </w:tcPr>
+          <w:p>
+            <w:r>
+              <w:t>Mobile 1 endpoint automation (code)</w:t>
+            </w:r>
+          </w:p>
+        </w:tc>
+        <w:tc>
+          <w:tcPr>
+            <w:tcW w:type="dxa" w:w="1728"/>
+          </w:tcPr>
+          <w:p>
+            <w:r>
+              <w:t>22.2%</w:t>
+            </w:r>
+          </w:p>
+        </w:tc>
+        <w:tc>
+          <w:tcPr>
+            <w:tcW w:type="dxa" w:w="1728"/>
+          </w:tcPr>
+          <w:p>
+            <w:r>
+              <w:t>2026-07-20T18:15:00-04:00</w:t>
+            </w:r>
+          </w:p>
+        </w:tc>
+        <w:tc>
+          <w:tcPr>
+            <w:tcW w:type="dxa" w:w="1728"/>
+          </w:tcPr>
+          <w:p>
+            <w:r>
+              <w:t>mobile/mobile1</w:t>
+            </w:r>
+          </w:p>
+        </w:tc>
+      </w:tr>
+      <w:tr>
+        <w:tc>
+          <w:tcPr>
+            <w:tcW w:type="dxa" w:w="1728"/>
+          </w:tcPr>
+          <w:p>
+            <w:r>
+              <w:t>Unite MSC</w:t>
+            </w:r>
+          </w:p>
+        </w:tc>
+        <w:tc>
+          <w:tcPr>
+            <w:tcW w:type="dxa" w:w="1728"/>
+          </w:tcPr>
+          <w:p>
+            <w:r>
+              <w:t>Mobile 1 execution-verified endpoints</w:t>
+            </w:r>
+          </w:p>
+        </w:tc>
+        <w:tc>
+          <w:tcPr>
+            <w:tcW w:type="dxa" w:w="1728"/>
+          </w:tcPr>
+          <w:p>
+            <w:r>
+              <w:t>3.7%</w:t>
+            </w:r>
+          </w:p>
+        </w:tc>
+        <w:tc>
+          <w:tcPr>
+            <w:tcW w:type="dxa" w:w="1728"/>
+          </w:tcPr>
+          <w:p>
+            <w:r>
+              <w:t>2026-07-09</w:t>
+            </w:r>
+          </w:p>
+        </w:tc>
+        <w:tc>
+          <w:tcPr>
+            <w:tcW w:type="dxa" w:w="1728"/>
+          </w:tcPr>
+          <w:p>
+            <w:r>
+              <w:t>03-document-postman-coverage-matrix.md</w:t>
+            </w:r>
+          </w:p>
+        </w:tc>
+      </w:tr>
+      <w:tr>
+        <w:tc>
+          <w:tcPr>
+            <w:tcW w:type="dxa" w:w="1728"/>
+          </w:tcPr>
+          <w:p>
+            <w:r>
+              <w:t>Universal Platform</w:t>
             </w:r>
           </w:p>
         </w:tc>
@@ -160,7 +316,7 @@
           </w:tcPr>
           <w:p>
             <w:r>
-              <w:t>379/436</w:t>
+              <w:t>86.9%</w:t>
             </w:r>
           </w:p>
         </w:tc>
@@ -180,7 +336,7 @@
           </w:tcPr>
           <w:p>
             <w:r>
-              <w:t>universal-platform-coverage/01-analysis/10-reconciliation-le</w:t>
+              <w:t>universal-platform-coverage</w:t>
             </w:r>
           </w:p>
         </w:tc>
@@ -192,7 +348,7 @@
           </w:tcPr>
           <w:p>
             <w:r>
-              <w:t>Business automation</w:t>
+              <w:t>Universal Platform</w:t>
             </w:r>
           </w:p>
         </w:tc>
@@ -202,7 +358,7 @@
           </w:tcPr>
           <w:p>
             <w:r>
-              <w:t>V2 UP-scoped qTest share</w:t>
+              <w:t>V3 GitLab scheduled job</w:t>
             </w:r>
           </w:p>
         </w:tc>
@@ -212,7 +368,7 @@
           </w:tcPr>
           <w:p>
             <w:r>
-              <w:t>268/744</w:t>
+              <w:t>100%</w:t>
             </w:r>
           </w:p>
         </w:tc>
@@ -222,7 +378,7 @@
           </w:tcPr>
           <w:p>
             <w:r>
-              <w:t>2026-06-29</w:t>
+              <w:t>2026-07-20T18:15:00-04:00</w:t>
             </w:r>
           </w:p>
         </w:tc>
@@ -232,7 +388,7 @@
           </w:tcPr>
           <w:p>
             <w:r>
-              <w:t>universal-platform-coverage/01-analysis/10-reconciliation-le</w:t>
+              <w:t>prime-test-automation/.gitlab-ci.yml</w:t>
             </w:r>
           </w:p>
         </w:tc>
@@ -244,7 +400,7 @@
           </w:tcPr>
           <w:p>
             <w:r>
-              <w:t>Business automation</w:t>
+              <w:t>Universal Platform</w:t>
             </w:r>
           </w:p>
         </w:tc>
@@ -254,7 +410,7 @@
           </w:tcPr>
           <w:p>
             <w:r>
-              <w:t>Mobile 2 verified endpoint automation</w:t>
+              <w:t>Metadataweb API GitLab job</w:t>
             </w:r>
           </w:p>
         </w:tc>
@@ -264,7 +420,7 @@
           </w:tcPr>
           <w:p>
             <w:r>
-              <w:t>22/25</w:t>
+              <w:t>100%</w:t>
             </w:r>
           </w:p>
         </w:tc>
@@ -274,7 +430,7 @@
           </w:tcPr>
           <w:p>
             <w:r>
-              <w:t>2026-07-14</w:t>
+              <w:t>2026-07-20T18:15:00-04:00</w:t>
             </w:r>
           </w:p>
         </w:tc>
@@ -284,111 +440,7 @@
           </w:tcPr>
           <w:p>
             <w:r>
-              <w:t>api-test-automation/mobile/project-documents/local-mobile-ap</w:t>
-            </w:r>
-          </w:p>
-        </w:tc>
-      </w:tr>
-      <w:tr>
-        <w:tc>
-          <w:tcPr>
-            <w:tcW w:type="dxa" w:w="1728"/>
-          </w:tcPr>
-          <w:p>
-            <w:r>
-              <w:t>Business automation</w:t>
-            </w:r>
-          </w:p>
-        </w:tc>
-        <w:tc>
-          <w:tcPr>
-            <w:tcW w:type="dxa" w:w="1728"/>
-          </w:tcPr>
-          <w:p>
-            <w:r>
-              <w:t>Mobile 1 verified endpoint automation</w:t>
-            </w:r>
-          </w:p>
-        </w:tc>
-        <w:tc>
-          <w:tcPr>
-            <w:tcW w:type="dxa" w:w="1728"/>
-          </w:tcPr>
-          <w:p>
-            <w:r>
-              <w:t>1/27</w:t>
-            </w:r>
-          </w:p>
-        </w:tc>
-        <w:tc>
-          <w:tcPr>
-            <w:tcW w:type="dxa" w:w="1728"/>
-          </w:tcPr>
-          <w:p>
-            <w:r>
-              <w:t>2026-07-09</w:t>
-            </w:r>
-          </w:p>
-        </w:tc>
-        <w:tc>
-          <w:tcPr>
-            <w:tcW w:type="dxa" w:w="1728"/>
-          </w:tcPr>
-          <w:p>
-            <w:r>
-              <w:t>api-test-automation/.../03-document-postman-coverage-matrix.</w:t>
-            </w:r>
-          </w:p>
-        </w:tc>
-      </w:tr>
-      <w:tr>
-        <w:tc>
-          <w:tcPr>
-            <w:tcW w:type="dxa" w:w="1728"/>
-          </w:tcPr>
-          <w:p>
-            <w:r>
-              <w:t>Gate coverage</w:t>
-            </w:r>
-          </w:p>
-        </w:tc>
-        <w:tc>
-          <w:tcPr>
-            <w:tcW w:type="dxa" w:w="1728"/>
-          </w:tcPr>
-          <w:p>
-            <w:r>
-              <w:t>V3 UI scheduled job hard-fail</w:t>
-            </w:r>
-          </w:p>
-        </w:tc>
-        <w:tc>
-          <w:tcPr>
-            <w:tcW w:type="dxa" w:w="1728"/>
-          </w:tcPr>
-          <w:p>
-            <w:r>
-              <w:t>1/1</w:t>
-            </w:r>
-          </w:p>
-        </w:tc>
-        <w:tc>
-          <w:tcPr>
-            <w:tcW w:type="dxa" w:w="1728"/>
-          </w:tcPr>
-          <w:p>
-            <w:r>
-              <w:t>2026-07-20</w:t>
-            </w:r>
-          </w:p>
-        </w:tc>
-        <w:tc>
-          <w:tcPr>
-            <w:tcW w:type="dxa" w:w="1728"/>
-          </w:tcPr>
-          <w:p>
-            <w:r>
-              <w:t>prime-test-automation/.gitlab-ci.yml</w:t>
+              <w:t>api-test-automation/.gitlab-ci.yml</w:t>
             </w:r>
           </w:p>
         </w:tc>
@@ -479,110 +531,6 @@
                 <w:b/>
               </w:rPr>
               <w:t>Dependency</w:t>
-            </w:r>
-          </w:p>
-        </w:tc>
-      </w:tr>
-      <w:tr>
-        <w:tc>
-          <w:tcPr>
-            <w:tcW w:type="dxa" w:w="1728"/>
-          </w:tcPr>
-          <w:p>
-            <w:r>
-              <w:t>Business automation</w:t>
-            </w:r>
-          </w:p>
-        </w:tc>
-        <w:tc>
-          <w:tcPr>
-            <w:tcW w:type="dxa" w:w="1728"/>
-          </w:tcPr>
-          <w:p>
-            <w:r>
-              <w:t>Mobile 2 code-implemented (pending sign-off)</w:t>
-            </w:r>
-          </w:p>
-        </w:tc>
-        <w:tc>
-          <w:tcPr>
-            <w:tcW w:type="dxa" w:w="1728"/>
-          </w:tcPr>
-          <w:p>
-            <w:r>
-              <w:t>24/25</w:t>
-            </w:r>
-          </w:p>
-        </w:tc>
-        <w:tc>
-          <w:tcPr>
-            <w:tcW w:type="dxa" w:w="1728"/>
-          </w:tcPr>
-          <w:p>
-            <w:r>
-              <w:t>2026-07-20</w:t>
-            </w:r>
-          </w:p>
-        </w:tc>
-        <w:tc>
-          <w:tcPr>
-            <w:tcW w:type="dxa" w:w="1728"/>
-          </w:tcPr>
-          <w:p>
-            <w:r>
-              <w:t>YTD + GET mobilebanks/{id} in code; QC4/Stage1 rerun + matrix refresh required</w:t>
-            </w:r>
-          </w:p>
-        </w:tc>
-      </w:tr>
-      <w:tr>
-        <w:tc>
-          <w:tcPr>
-            <w:tcW w:type="dxa" w:w="1728"/>
-          </w:tcPr>
-          <w:p>
-            <w:r>
-              <w:t>Business automation</w:t>
-            </w:r>
-          </w:p>
-        </w:tc>
-        <w:tc>
-          <w:tcPr>
-            <w:tcW w:type="dxa" w:w="1728"/>
-          </w:tcPr>
-          <w:p>
-            <w:r>
-              <w:t>Mobile 1 implemented pending evidence</w:t>
-            </w:r>
-          </w:p>
-        </w:tc>
-        <w:tc>
-          <w:tcPr>
-            <w:tcW w:type="dxa" w:w="1728"/>
-          </w:tcPr>
-          <w:p>
-            <w:r>
-              <w:t>6/27</w:t>
-            </w:r>
-          </w:p>
-        </w:tc>
-        <w:tc>
-          <w:tcPr>
-            <w:tcW w:type="dxa" w:w="1728"/>
-          </w:tcPr>
-          <w:p>
-            <w:r>
-              <w:t>2026-07-20</w:t>
-            </w:r>
-          </w:p>
-        </w:tc>
-        <w:tc>
-          <w:tcPr>
-            <w:tcW w:type="dxa" w:w="1728"/>
-          </w:tcPr>
-          <w:p>
-            <w:r>
-              <w:t>Five endpoints implemented; not sign-off ready</w:t>
             </w:r>
           </w:p>
         </w:tc>

</xml_diff>

<commit_message>
Add new assessments and coverage summaries for Government Savings automation
- Introduced detailed assessments for ASTRO/SFRP and Back-office/Batch automation, outlining current status, execution findings, and revalidation efforts required.
- Added new CSV files for business coverage metrics, including the Government Savings Business Coverage Register and Legacy Unite Module Status.
- Updated the Government Savings Automation Coverage Assessment document to reflect the latest findings and recommendations for operational activation.
- Created a comprehensive Business Coverage Summary to provide leadership with insights into automation maturity across platforms.

These additions aim to enhance visibility into automation coverage and facilitate informed decision-making for future improvements.
</commit_message>
<xml_diff>
--- a/government-savings-automation-assessment/04-leadership/Government-Savings-Automation-Coverage-Assessment.docx
+++ b/government-savings-automation-assessment/04-leadership/Government-Savings-Automation-Coverage-Assessment.docx
@@ -42,7 +42,7 @@
     </w:p>
     <w:p>
       <w:r>
-        <w:t>Government Savings has meaningful automation across V3 UI (GitLab scheduled regression), legacy V2 (large Jenkins/Ant corpus), MSC Mobile APIs, metadataweb API nightly, and performance assets. A single GS-wide coverage percentage is not defensible without governed denominators. Verified platform metrics are reported separately from pending sign-off metrics.</w:t>
+        <w:t>Government Savings automation is organized by business platform and operational activation — what is implemented, what runs on recurring schedules, and what awaits reactivation. A single GS-wide coverage percentage is not defensible. Inventory-share metrics (e.g. V2/V3 TestNG or qTest populations) appear in the technical appendix only, not as functional completeness.</w:t>
       </w:r>
     </w:p>
     <w:p>
@@ -50,7 +50,979 @@
         <w:pStyle w:val="Heading1"/>
       </w:pPr>
       <w:r>
-        <w:t>Verified Metrics (leadership-safe)</w:t>
+        <w:t>Business Platform Coverage</w:t>
+      </w:r>
+    </w:p>
+    <w:tbl>
+      <w:tblPr>
+        <w:tblStyle w:val="TableGrid"/>
+        <w:tblW w:type="auto" w:w="0"/>
+        <w:tblLook w:firstColumn="1" w:firstRow="1" w:lastColumn="0" w:lastRow="0" w:noHBand="0" w:noVBand="1" w:val="04A0"/>
+      </w:tblPr>
+      <w:tblGrid>
+        <w:gridCol w:w="1440"/>
+        <w:gridCol w:w="1440"/>
+        <w:gridCol w:w="1440"/>
+        <w:gridCol w:w="1440"/>
+        <w:gridCol w:w="1440"/>
+        <w:gridCol w:w="1440"/>
+      </w:tblGrid>
+      <w:tr>
+        <w:tc>
+          <w:tcPr>
+            <w:tcW w:type="dxa" w:w="1440"/>
+          </w:tcPr>
+          <w:p>
+            <w:r>
+              <w:rPr>
+                <w:b/>
+              </w:rPr>
+              <w:t>Business area</w:t>
+            </w:r>
+          </w:p>
+        </w:tc>
+        <w:tc>
+          <w:tcPr>
+            <w:tcW w:type="dxa" w:w="1440"/>
+          </w:tcPr>
+          <w:p>
+            <w:r>
+              <w:rPr>
+                <w:b/>
+              </w:rPr>
+              <w:t>Sub-area</w:t>
+            </w:r>
+          </w:p>
+        </w:tc>
+        <w:tc>
+          <w:tcPr>
+            <w:tcW w:type="dxa" w:w="1440"/>
+          </w:tcPr>
+          <w:p>
+            <w:r>
+              <w:rPr>
+                <w:b/>
+              </w:rPr>
+              <w:t>Position</w:t>
+            </w:r>
+          </w:p>
+        </w:tc>
+        <w:tc>
+          <w:tcPr>
+            <w:tcW w:type="dxa" w:w="1440"/>
+          </w:tcPr>
+          <w:p>
+            <w:r>
+              <w:rPr>
+                <w:b/>
+              </w:rPr>
+              <w:t>Implementation</w:t>
+            </w:r>
+          </w:p>
+        </w:tc>
+        <w:tc>
+          <w:tcPr>
+            <w:tcW w:type="dxa" w:w="1440"/>
+          </w:tcPr>
+          <w:p>
+            <w:r>
+              <w:rPr>
+                <w:b/>
+              </w:rPr>
+              <w:t>Scheduled</w:t>
+            </w:r>
+          </w:p>
+        </w:tc>
+        <w:tc>
+          <w:tcPr>
+            <w:tcW w:type="dxa" w:w="1440"/>
+          </w:tcPr>
+          <w:p>
+            <w:r>
+              <w:rPr>
+                <w:b/>
+              </w:rPr>
+              <w:t>Confidence</w:t>
+            </w:r>
+          </w:p>
+        </w:tc>
+      </w:tr>
+      <w:tr>
+        <w:tc>
+          <w:tcPr>
+            <w:tcW w:type="dxa" w:w="1440"/>
+          </w:tcPr>
+          <w:p>
+            <w:r>
+              <w:t>Unite MSC</w:t>
+            </w:r>
+          </w:p>
+        </w:tc>
+        <w:tc>
+          <w:tcPr>
+            <w:tcW w:type="dxa" w:w="1440"/>
+          </w:tcPr>
+          <w:p>
+            <w:r>
+              <w:t>Mobile 2 API</w:t>
+            </w:r>
+          </w:p>
+        </w:tc>
+        <w:tc>
+          <w:tcPr>
+            <w:tcW w:type="dxa" w:w="1440"/>
+          </w:tcPr>
+          <w:p>
+            <w:r>
+              <w:t>Mobile 2 automation is complete for the currently defined automatable business scope; dest…</w:t>
+            </w:r>
+          </w:p>
+        </w:tc>
+        <w:tc>
+          <w:tcPr>
+            <w:tcW w:type="dxa" w:w="1440"/>
+          </w:tcPr>
+          <w:p>
+            <w:r>
+              <w:t>Complete for automatable scope</w:t>
+            </w:r>
+          </w:p>
+        </w:tc>
+        <w:tc>
+          <w:tcPr>
+            <w:tcW w:type="dxa" w:w="1440"/>
+          </w:tcPr>
+          <w:p>
+            <w:r>
+              <w:t>Not scheduled — QA-1405 pending</w:t>
+            </w:r>
+          </w:p>
+        </w:tc>
+        <w:tc>
+          <w:tcPr>
+            <w:tcW w:type="dxa" w:w="1440"/>
+          </w:tcPr>
+          <w:p>
+            <w:r>
+              <w:t>High</w:t>
+            </w:r>
+          </w:p>
+        </w:tc>
+      </w:tr>
+      <w:tr>
+        <w:tc>
+          <w:tcPr>
+            <w:tcW w:type="dxa" w:w="1440"/>
+          </w:tcPr>
+          <w:p>
+            <w:r>
+              <w:t>Unite MSC</w:t>
+            </w:r>
+          </w:p>
+        </w:tc>
+        <w:tc>
+          <w:tcPr>
+            <w:tcW w:type="dxa" w:w="1440"/>
+          </w:tcPr>
+          <w:p>
+            <w:r>
+              <w:t>Mobile 2 API</w:t>
+            </w:r>
+          </w:p>
+        </w:tc>
+        <w:tc>
+          <w:tcPr>
+            <w:tcW w:type="dxa" w:w="1440"/>
+          </w:tcPr>
+          <w:p>
+            <w:r>
+              <w:t>Near-complete for documented business scope; harness endpoint excluded from automation num…</w:t>
+            </w:r>
+          </w:p>
+        </w:tc>
+        <w:tc>
+          <w:tcPr>
+            <w:tcW w:type="dxa" w:w="1440"/>
+          </w:tcPr>
+          <w:p>
+            <w:r>
+              <w:t>24/25 implemented</w:t>
+            </w:r>
+          </w:p>
+        </w:tc>
+        <w:tc>
+          <w:tcPr>
+            <w:tcW w:type="dxa" w:w="1440"/>
+          </w:tcPr>
+          <w:p>
+            <w:r>
+              <w:t>Not scheduled</w:t>
+            </w:r>
+          </w:p>
+        </w:tc>
+        <w:tc>
+          <w:tcPr>
+            <w:tcW w:type="dxa" w:w="1440"/>
+          </w:tcPr>
+          <w:p>
+            <w:r>
+              <w:t>High</w:t>
+            </w:r>
+          </w:p>
+        </w:tc>
+      </w:tr>
+      <w:tr>
+        <w:tc>
+          <w:tcPr>
+            <w:tcW w:type="dxa" w:w="1440"/>
+          </w:tcPr>
+          <w:p>
+            <w:r>
+              <w:t>Unite MSC</w:t>
+            </w:r>
+          </w:p>
+        </w:tc>
+        <w:tc>
+          <w:tcPr>
+            <w:tcW w:type="dxa" w:w="1440"/>
+          </w:tcPr>
+          <w:p>
+            <w:r>
+              <w:t>Mobile 1 API</w:t>
+            </w:r>
+          </w:p>
+        </w:tc>
+        <w:tc>
+          <w:tcPr>
+            <w:tcW w:type="dxa" w:w="1440"/>
+          </w:tcPr>
+          <w:p>
+            <w:r>
+              <w:t>Partial coverage with expansion in progress on owner profile beneficiary and bank routing</w:t>
+            </w:r>
+          </w:p>
+        </w:tc>
+        <w:tc>
+          <w:tcPr>
+            <w:tcW w:type="dxa" w:w="1440"/>
+          </w:tcPr>
+          <w:p>
+            <w:r>
+              <w:t>Partial — sprint expansion</w:t>
+            </w:r>
+          </w:p>
+        </w:tc>
+        <w:tc>
+          <w:tcPr>
+            <w:tcW w:type="dxa" w:w="1440"/>
+          </w:tcPr>
+          <w:p>
+            <w:r>
+              <w:t>Not scheduled</w:t>
+            </w:r>
+          </w:p>
+        </w:tc>
+        <w:tc>
+          <w:tcPr>
+            <w:tcW w:type="dxa" w:w="1440"/>
+          </w:tcPr>
+          <w:p>
+            <w:r>
+              <w:t>High</w:t>
+            </w:r>
+          </w:p>
+        </w:tc>
+      </w:tr>
+      <w:tr>
+        <w:tc>
+          <w:tcPr>
+            <w:tcW w:type="dxa" w:w="1440"/>
+          </w:tcPr>
+          <w:p>
+            <w:r>
+              <w:t>Unite MSC</w:t>
+            </w:r>
+          </w:p>
+        </w:tc>
+        <w:tc>
+          <w:tcPr>
+            <w:tcW w:type="dxa" w:w="1440"/>
+          </w:tcPr>
+          <w:p>
+            <w:r>
+              <w:t>Mobile Enrollment API</w:t>
+            </w:r>
+          </w:p>
+        </w:tc>
+        <w:tc>
+          <w:tcPr>
+            <w:tcW w:type="dxa" w:w="1440"/>
+          </w:tcPr>
+          <w:p>
+            <w:r>
+              <w:t>Pilot framework in place; endpoint inventory and automation scope not yet enumerated</w:t>
+            </w:r>
+          </w:p>
+        </w:tc>
+        <w:tc>
+          <w:tcPr>
+            <w:tcW w:type="dxa" w:w="1440"/>
+          </w:tcPr>
+          <w:p>
+            <w:r>
+              <w:t>Bootstrap smoke only</w:t>
+            </w:r>
+          </w:p>
+        </w:tc>
+        <w:tc>
+          <w:tcPr>
+            <w:tcW w:type="dxa" w:w="1440"/>
+          </w:tcPr>
+          <w:p>
+            <w:r>
+              <w:t>Not scheduled</w:t>
+            </w:r>
+          </w:p>
+        </w:tc>
+        <w:tc>
+          <w:tcPr>
+            <w:tcW w:type="dxa" w:w="1440"/>
+          </w:tcPr>
+          <w:p>
+            <w:r>
+              <w:t>Medium</w:t>
+            </w:r>
+          </w:p>
+        </w:tc>
+      </w:tr>
+      <w:tr>
+        <w:tc>
+          <w:tcPr>
+            <w:tcW w:type="dxa" w:w="1440"/>
+          </w:tcPr>
+          <w:p>
+            <w:r>
+              <w:t>Unite MSC</w:t>
+            </w:r>
+          </w:p>
+        </w:tc>
+        <w:tc>
+          <w:tcPr>
+            <w:tcW w:type="dxa" w:w="1440"/>
+          </w:tcPr>
+          <w:p>
+            <w:r>
+              <w:t>UniteMSC microservices</w:t>
+            </w:r>
+          </w:p>
+        </w:tc>
+        <w:tc>
+          <w:tcPr>
+            <w:tcW w:type="dxa" w:w="1440"/>
+          </w:tcPr>
+          <w:p>
+            <w:r>
+              <w:t>Service acceptance automation exists; not a substitute for BFF API regression</w:t>
+            </w:r>
+          </w:p>
+        </w:tc>
+        <w:tc>
+          <w:tcPr>
+            <w:tcW w:type="dxa" w:w="1440"/>
+          </w:tcPr>
+          <w:p>
+            <w:r>
+              <w:t>Substantial service-level assets</w:t>
+            </w:r>
+          </w:p>
+        </w:tc>
+        <w:tc>
+          <w:tcPr>
+            <w:tcW w:type="dxa" w:w="1440"/>
+          </w:tcPr>
+          <w:p>
+            <w:r>
+              <w:t>Per-repo GitLab pipeline</w:t>
+            </w:r>
+          </w:p>
+        </w:tc>
+        <w:tc>
+          <w:tcPr>
+            <w:tcW w:type="dxa" w:w="1440"/>
+          </w:tcPr>
+          <w:p>
+            <w:r>
+              <w:t>Medium</w:t>
+            </w:r>
+          </w:p>
+        </w:tc>
+      </w:tr>
+      <w:tr>
+        <w:tc>
+          <w:tcPr>
+            <w:tcW w:type="dxa" w:w="1440"/>
+          </w:tcPr>
+          <w:p>
+            <w:r>
+              <w:t>Unite MSC</w:t>
+            </w:r>
+          </w:p>
+        </w:tc>
+        <w:tc>
+          <w:tcPr>
+            <w:tcW w:type="dxa" w:w="1440"/>
+          </w:tcPr>
+          <w:p>
+            <w:r>
+              <w:t>Application source code</w:t>
+            </w:r>
+          </w:p>
+        </w:tc>
+        <w:tc>
+          <w:tcPr>
+            <w:tcW w:type="dxa" w:w="1440"/>
+          </w:tcPr>
+          <w:p>
+            <w:r>
+              <w:t>Application line coverage separate from business automation; no coverage-delta MR gate</w:t>
+            </w:r>
+          </w:p>
+        </w:tc>
+        <w:tc>
+          <w:tcPr>
+            <w:tcW w:type="dxa" w:w="1440"/>
+          </w:tcPr>
+          <w:p>
+            <w:r>
+              <w:t>Generated in CI</w:t>
+            </w:r>
+          </w:p>
+        </w:tc>
+        <w:tc>
+          <w:tcPr>
+            <w:tcW w:type="dxa" w:w="1440"/>
+          </w:tcPr>
+          <w:p>
+            <w:r>
+              <w:t>Service build/test gate</w:t>
+            </w:r>
+          </w:p>
+        </w:tc>
+        <w:tc>
+          <w:tcPr>
+            <w:tcW w:type="dxa" w:w="1440"/>
+          </w:tcPr>
+          <w:p>
+            <w:r>
+              <w:t>High</w:t>
+            </w:r>
+          </w:p>
+        </w:tc>
+      </w:tr>
+      <w:tr>
+        <w:tc>
+          <w:tcPr>
+            <w:tcW w:type="dxa" w:w="1440"/>
+          </w:tcPr>
+          <w:p>
+            <w:r>
+              <w:t>Unite MSC</w:t>
+            </w:r>
+          </w:p>
+        </w:tc>
+        <w:tc>
+          <w:tcPr>
+            <w:tcW w:type="dxa" w:w="1440"/>
+          </w:tcPr>
+          <w:p>
+            <w:r>
+              <w:t>GitHub Actions</w:t>
+            </w:r>
+          </w:p>
+        </w:tc>
+        <w:tc>
+          <w:tcPr>
+            <w:tcW w:type="dxa" w:w="1440"/>
+          </w:tcPr>
+          <w:p>
+            <w:r>
+              <w:t>Deployment validation — not nightly business regression</w:t>
+            </w:r>
+          </w:p>
+        </w:tc>
+        <w:tc>
+          <w:tcPr>
+            <w:tcW w:type="dxa" w:w="1440"/>
+          </w:tcPr>
+          <w:p>
+            <w:r>
+              <w:t>Deployment slice validated</w:t>
+            </w:r>
+          </w:p>
+        </w:tc>
+        <w:tc>
+          <w:tcPr>
+            <w:tcW w:type="dxa" w:w="1440"/>
+          </w:tcPr>
+          <w:p>
+            <w:r>
+              <w:t>Workflow not in clone</w:t>
+            </w:r>
+          </w:p>
+        </w:tc>
+        <w:tc>
+          <w:tcPr>
+            <w:tcW w:type="dxa" w:w="1440"/>
+          </w:tcPr>
+          <w:p>
+            <w:r>
+              <w:t>Medium</w:t>
+            </w:r>
+          </w:p>
+        </w:tc>
+      </w:tr>
+      <w:tr>
+        <w:tc>
+          <w:tcPr>
+            <w:tcW w:type="dxa" w:w="1440"/>
+          </w:tcPr>
+          <w:p>
+            <w:r>
+              <w:t>Universal Platform</w:t>
+            </w:r>
+          </w:p>
+        </w:tc>
+        <w:tc>
+          <w:tcPr>
+            <w:tcW w:type="dxa" w:w="1440"/>
+          </w:tcPr>
+          <w:p>
+            <w:r>
+              <w:t>Universal Enrollment</w:t>
+            </w:r>
+          </w:p>
+        </w:tc>
+        <w:tc>
+          <w:tcPr>
+            <w:tcW w:type="dxa" w:w="1440"/>
+          </w:tcPr>
+          <w:p>
+            <w:r>
+              <w:t>Majority of current high-priority enrollment journeys automated in Modern Unite nightly</w:t>
+            </w:r>
+          </w:p>
+        </w:tc>
+        <w:tc>
+          <w:tcPr>
+            <w:tcW w:type="dxa" w:w="1440"/>
+          </w:tcPr>
+          <w:p>
+            <w:r>
+              <w:t>Near-complete for approved regression scope</w:t>
+            </w:r>
+          </w:p>
+        </w:tc>
+        <w:tc>
+          <w:tcPr>
+            <w:tcW w:type="dxa" w:w="1440"/>
+          </w:tcPr>
+          <w:p>
+            <w:r>
+              <w:t>scheduled_regression_job</w:t>
+            </w:r>
+          </w:p>
+        </w:tc>
+        <w:tc>
+          <w:tcPr>
+            <w:tcW w:type="dxa" w:w="1440"/>
+          </w:tcPr>
+          <w:p>
+            <w:r>
+              <w:t>High</w:t>
+            </w:r>
+          </w:p>
+        </w:tc>
+      </w:tr>
+      <w:tr>
+        <w:tc>
+          <w:tcPr>
+            <w:tcW w:type="dxa" w:w="1440"/>
+          </w:tcPr>
+          <w:p>
+            <w:r>
+              <w:t>Universal Platform</w:t>
+            </w:r>
+          </w:p>
+        </w:tc>
+        <w:tc>
+          <w:tcPr>
+            <w:tcW w:type="dxa" w:w="1440"/>
+          </w:tcPr>
+          <w:p>
+            <w:r>
+              <w:t>IDP / Authentication</w:t>
+            </w:r>
+          </w:p>
+        </w:tc>
+        <w:tc>
+          <w:tcPr>
+            <w:tcW w:type="dxa" w:w="1440"/>
+          </w:tcPr>
+          <w:p>
+            <w:r>
+              <w:t>Near-complete automation for current documented IDP regression scope</w:t>
+            </w:r>
+          </w:p>
+        </w:tc>
+        <w:tc>
+          <w:tcPr>
+            <w:tcW w:type="dxa" w:w="1440"/>
+          </w:tcPr>
+          <w:p>
+            <w:r>
+              <w:t>Near-complete for approved regression scope</w:t>
+            </w:r>
+          </w:p>
+        </w:tc>
+        <w:tc>
+          <w:tcPr>
+            <w:tcW w:type="dxa" w:w="1440"/>
+          </w:tcPr>
+          <w:p>
+            <w:r>
+              <w:t>scheduled_regression_job</w:t>
+            </w:r>
+          </w:p>
+        </w:tc>
+        <w:tc>
+          <w:tcPr>
+            <w:tcW w:type="dxa" w:w="1440"/>
+          </w:tcPr>
+          <w:p>
+            <w:r>
+              <w:t>High</w:t>
+            </w:r>
+          </w:p>
+        </w:tc>
+      </w:tr>
+      <w:tr>
+        <w:tc>
+          <w:tcPr>
+            <w:tcW w:type="dxa" w:w="1440"/>
+          </w:tcPr>
+          <w:p>
+            <w:r>
+              <w:t>Universal Platform</w:t>
+            </w:r>
+          </w:p>
+        </w:tc>
+        <w:tc>
+          <w:tcPr>
+            <w:tcW w:type="dxa" w:w="1440"/>
+          </w:tcPr>
+          <w:p>
+            <w:r>
+              <w:t>Withdrawals</w:t>
+            </w:r>
+          </w:p>
+        </w:tc>
+        <w:tc>
+          <w:tcPr>
+            <w:tcW w:type="dxa" w:w="1440"/>
+          </w:tcPr>
+          <w:p>
+            <w:r>
+              <w:t>Withdrawal domain automated in nightly; transfers adjacent (12 V2 methods)</w:t>
+            </w:r>
+          </w:p>
+        </w:tc>
+        <w:tc>
+          <w:tcPr>
+            <w:tcW w:type="dxa" w:w="1440"/>
+          </w:tcPr>
+          <w:p>
+            <w:r>
+              <w:t>Near-complete for withdrawal regression scope</w:t>
+            </w:r>
+          </w:p>
+        </w:tc>
+        <w:tc>
+          <w:tcPr>
+            <w:tcW w:type="dxa" w:w="1440"/>
+          </w:tcPr>
+          <w:p>
+            <w:r>
+              <w:t>scheduled_regression_job</w:t>
+            </w:r>
+          </w:p>
+        </w:tc>
+        <w:tc>
+          <w:tcPr>
+            <w:tcW w:type="dxa" w:w="1440"/>
+          </w:tcPr>
+          <w:p>
+            <w:r>
+              <w:t>High</w:t>
+            </w:r>
+          </w:p>
+        </w:tc>
+      </w:tr>
+      <w:tr>
+        <w:tc>
+          <w:tcPr>
+            <w:tcW w:type="dxa" w:w="1440"/>
+          </w:tcPr>
+          <w:p>
+            <w:r>
+              <w:t>Universal Platform</w:t>
+            </w:r>
+          </w:p>
+        </w:tc>
+        <w:tc>
+          <w:tcPr>
+            <w:tcW w:type="dxa" w:w="1440"/>
+          </w:tcPr>
+          <w:p>
+            <w:r>
+              <w:t>Entity / ABLE Entity</w:t>
+            </w:r>
+          </w:p>
+        </w:tc>
+        <w:tc>
+          <w:tcPr>
+            <w:tcW w:type="dxa" w:w="1440"/>
+          </w:tcPr>
+          <w:p>
+            <w:r>
+              <w:t>Partial coverage with expansion in progress; remaining work primarily Entity and newly mig…</w:t>
+            </w:r>
+          </w:p>
+        </w:tc>
+        <w:tc>
+          <w:tcPr>
+            <w:tcW w:type="dxa" w:w="1440"/>
+          </w:tcPr>
+          <w:p>
+            <w:r>
+              <w:t>Partial — 6 scenarios in repo</w:t>
+            </w:r>
+          </w:p>
+        </w:tc>
+        <w:tc>
+          <w:tcPr>
+            <w:tcW w:type="dxa" w:w="1440"/>
+          </w:tcPr>
+          <w:p>
+            <w:r>
+              <w:t>Unknown pipeline inclusion</w:t>
+            </w:r>
+          </w:p>
+        </w:tc>
+        <w:tc>
+          <w:tcPr>
+            <w:tcW w:type="dxa" w:w="1440"/>
+          </w:tcPr>
+          <w:p>
+            <w:r>
+              <w:t>High</w:t>
+            </w:r>
+          </w:p>
+        </w:tc>
+      </w:tr>
+      <w:tr>
+        <w:tc>
+          <w:tcPr>
+            <w:tcW w:type="dxa" w:w="1440"/>
+          </w:tcPr>
+          <w:p>
+            <w:r>
+              <w:t>Universal Platform</w:t>
+            </w:r>
+          </w:p>
+        </w:tc>
+        <w:tc>
+          <w:tcPr>
+            <w:tcW w:type="dxa" w:w="1440"/>
+          </w:tcPr>
+          <w:p>
+            <w:r>
+              <w:t>Angular lib-ui</w:t>
+            </w:r>
+          </w:p>
+        </w:tc>
+        <w:tc>
+          <w:tcPr>
+            <w:tcW w:type="dxa" w:w="1440"/>
+          </w:tcPr>
+          <w:p>
+            <w:r>
+              <w:t>Component tests — not E2E business journey coverage</w:t>
+            </w:r>
+          </w:p>
+        </w:tc>
+        <w:tc>
+          <w:tcPr>
+            <w:tcW w:type="dxa" w:w="1440"/>
+          </w:tcPr>
+          <w:p>
+            <w:r>
+              <w:t>Component-level only</w:t>
+            </w:r>
+          </w:p>
+        </w:tc>
+        <w:tc>
+          <w:tcPr>
+            <w:tcW w:type="dxa" w:w="1440"/>
+          </w:tcPr>
+          <w:p>
+            <w:r>
+              <w:t>accountowner_build_tdd partial</w:t>
+            </w:r>
+          </w:p>
+        </w:tc>
+        <w:tc>
+          <w:tcPr>
+            <w:tcW w:type="dxa" w:w="1440"/>
+          </w:tcPr>
+          <w:p>
+            <w:r>
+              <w:t>Medium</w:t>
+            </w:r>
+          </w:p>
+        </w:tc>
+      </w:tr>
+      <w:tr>
+        <w:tc>
+          <w:tcPr>
+            <w:tcW w:type="dxa" w:w="1440"/>
+          </w:tcPr>
+          <w:p>
+            <w:r>
+              <w:t>Universal Platform</w:t>
+            </w:r>
+          </w:p>
+        </w:tc>
+        <w:tc>
+          <w:tcPr>
+            <w:tcW w:type="dxa" w:w="1440"/>
+          </w:tcPr>
+          <w:p>
+            <w:r>
+              <w:t>Universal API (scoped)</w:t>
+            </w:r>
+          </w:p>
+        </w:tc>
+        <w:tc>
+          <w:tcPr>
+            <w:tcW w:type="dxa" w:w="1440"/>
+          </w:tcPr>
+          <w:p>
+            <w:r>
+              <w:t>API automation exists beyond metadata; only metadataweb on GitLab schedule today</w:t>
+            </w:r>
+          </w:p>
+        </w:tc>
+        <w:tc>
+          <w:tcPr>
+            <w:tcW w:type="dxa" w:w="1440"/>
+          </w:tcPr>
+          <w:p>
+            <w:r>
+              <w:t>11 ops mapped in UP ledger</w:t>
+            </w:r>
+          </w:p>
+        </w:tc>
+        <w:tc>
+          <w:tcPr>
+            <w:tcW w:type="dxa" w:w="1440"/>
+          </w:tcPr>
+          <w:p>
+            <w:r>
+              <w:t>scheduled_metadataweb_stage1</w:t>
+            </w:r>
+          </w:p>
+        </w:tc>
+        <w:tc>
+          <w:tcPr>
+            <w:tcW w:type="dxa" w:w="1440"/>
+          </w:tcPr>
+          <w:p>
+            <w:r>
+              <w:t>High</w:t>
+            </w:r>
+          </w:p>
+        </w:tc>
+      </w:tr>
+      <w:tr>
+        <w:tc>
+          <w:tcPr>
+            <w:tcW w:type="dxa" w:w="1440"/>
+          </w:tcPr>
+          <w:p>
+            <w:r>
+              <w:t>Universal Platform</w:t>
+            </w:r>
+          </w:p>
+        </w:tc>
+        <w:tc>
+          <w:tcPr>
+            <w:tcW w:type="dxa" w:w="1440"/>
+          </w:tcPr>
+          <w:p>
+            <w:r>
+              <w:t>Performance journeys</w:t>
+            </w:r>
+          </w:p>
+        </w:tc>
+        <w:tc>
+          <w:tcPr>
+            <w:tcW w:type="dxa" w:w="1440"/>
+          </w:tcPr>
+          <w:p>
+            <w:r>
+              <w:t>Performance assets exist; not all journeys on recurring schedule</w:t>
+            </w:r>
+          </w:p>
+        </w:tc>
+        <w:tc>
+          <w:tcPr>
+            <w:tcW w:type="dxa" w:w="1440"/>
+          </w:tcPr>
+          <w:p>
+            <w:r>
+              <w:t>IDP perf scheduled; others manual</w:t>
+            </w:r>
+          </w:p>
+        </w:tc>
+        <w:tc>
+          <w:tcPr>
+            <w:tcW w:type="dxa" w:w="1440"/>
+          </w:tcPr>
+          <w:p>
+            <w:r>
+              <w:t>Partial scheduled</w:t>
+            </w:r>
+          </w:p>
+        </w:tc>
+        <w:tc>
+          <w:tcPr>
+            <w:tcW w:type="dxa" w:w="1440"/>
+          </w:tcPr>
+          <w:p>
+            <w:r>
+              <w:t>Medium</w:t>
+            </w:r>
+          </w:p>
+        </w:tc>
+      </w:tr>
+    </w:tbl>
+    <w:p/>
+    <w:p>
+      <w:pPr>
+        <w:pStyle w:val="Heading1"/>
+      </w:pPr>
+      <w:r>
+        <w:t>Verified Metrics Register</w:t>
       </w:r>
     </w:p>
     <w:tbl>

</xml_diff>